<commit_message>
Streamline episode rundown: membership-form cold open, shake as running gag, drop motivational-quotes segment
Co-Authored-By: Claude Opus 5.5 <noreply@anthropic.com>
Claude-Session: https://claude.ai/code/session_0137k8WBPQi7xN5FQteosu59
</commit_message>
<xml_diff>
--- a/pitches/LOCKER_ROOM_TALK_TV.docx
+++ b/pitches/LOCKER_ROOM_TALK_TV.docx
@@ -606,7 +606,7 @@
         <w:spacing w:after="100"/>
       </w:pPr>
       <w:r>
-        <w:t xml:space="preserve">Es ist und bleibt ein Gesprächsformat: Die Gästinnen setzen die Themen mit ihren Inhalten, aber auch mit ihrer Geschichte. Das Ganze wird maximal unterhaltsam umgesetzt, mit wiederkehrenden Elementen:</w:t>
+        <w:t xml:space="preserve">Es ist und bleibt ein Gesprächsformat: Die Gästinnen setzen die Themen mit ihren Inhalten, aber auch mit ihrer Geschichte. Jede Folge folgt derselben Kurve: erst warm werden, dann tief reden, dann knallt es. Drei Programmpunkte, zwei kurze Rituale:</w:t>
       </w:r>
     </w:p>
     <w:p>
@@ -622,10 +622,10 @@
           <w:b/>
           <w:bCs/>
         </w:rPr>
-        <w:t xml:space="preserve">Kaltstart (ca. 1 Min.):</w:t>
-      </w:r>
-      <w:r>
-        <w:t xml:space="preserve"> Ein echtes Zitat aus einer echten Männerkabine, aus Politik, Fußball oder dem Wahlkampf 2016. Die Gästin liest vor, Katja kommentiert. Dann geht die Kabinentür zu.</w:t>
+        <w:t xml:space="preserve">Kaltstart: Mitgliedsantrag (ca. 1 Min.):</w:t>
+      </w:r>
+      <w:r>
+        <w:t xml:space="preserve"> Die Gästin kommt in Straßenkleidung und zieht sich um. Währenddessen liest Katja ihren Mitgliedsantrag für die Muckibude vor: Trainingsziel („Patriarchat stemmen“), bisherige Verletzungen („Shitstorm 2023“), Maximalgewicht („eine Koalition“). Die Gästin korrigiert und kommentiert live.</w:t>
       </w:r>
     </w:p>
     <w:p>
@@ -641,10 +641,10 @@
           <w:b/>
           <w:bCs/>
         </w:rPr>
-        <w:t xml:space="preserve">Training (ca. 6 Min.):</w:t>
-      </w:r>
-      <w:r>
-        <w:t xml:space="preserve"> Zum Einstieg wird gemeinsam trainiert: Hanteln, Laufband, Klimmzüge. Dabei diskutieren wir die steilsten Thesen der Gästin. Je steiler die These, desto schwerer die Hantel.</w:t>
+        <w:t xml:space="preserve">Aufwärmen (ca. 6 Min.):</w:t>
+      </w:r>
+      <w:r>
+        <w:t xml:space="preserve"> Laufband, Schattenboxen, Handtuch schnippen. Dabei geht es ums Persönliche: Herkunft, Werdegang, Turning Points. Wer außer Atem ist, redet ehrlicher.</w:t>
       </w:r>
     </w:p>
     <w:p>
@@ -660,10 +660,10 @@
           <w:b/>
           <w:bCs/>
         </w:rPr>
-        <w:t xml:space="preserve">Auf der Bank (ca. 10 Min.):</w:t>
-      </w:r>
-      <w:r>
-        <w:t xml:space="preserve"> Das Herzstück: Herkunft, Werdegang, Turning Points, und dann die große Frage, wie die Gästin die Welt umbauen würde. Und was sie von „Bye Bye Boys“ hält.</w:t>
+        <w:t xml:space="preserve">Auf der Bank (ca. 12 Min.):</w:t>
+      </w:r>
+      <w:r>
+        <w:t xml:space="preserve"> Das Herzstück: vom eigenen Weg zur großen Frage, wie die Gästin die Welt umbauen würde. Und was sie von „Bye Bye Boys“ hält.</w:t>
       </w:r>
     </w:p>
     <w:p>
@@ -679,10 +679,10 @@
           <w:b/>
           <w:bCs/>
         </w:rPr>
-        <w:t xml:space="preserve">Eiweiß-Verpflegung (ca. 2 Min.):</w:t>
-      </w:r>
-      <w:r>
-        <w:t xml:space="preserve"> Proteinshake mit einem zur Agenda der Gästin passenden Namen („Der Umverteiler“, „Die Quote“ usw.). Der Geschmack wird live bewertet.</w:t>
+        <w:t xml:space="preserve">Hantel-Runde (ca. 7 Min.):</w:t>
+      </w:r>
+      <w:r>
+        <w:t xml:space="preserve"> Der Höhepunkt: Jetzt kommen die steilsten Thesen der Gästin auf den Tisch. Je steiler die These, desto schwerer die Hantel.</w:t>
       </w:r>
     </w:p>
     <w:p>
@@ -698,10 +698,10 @@
           <w:b/>
           <w:bCs/>
         </w:rPr>
-        <w:t xml:space="preserve">Locker-Room-Disziplin (ca. 4 Min.):</w:t>
-      </w:r>
-      <w:r>
-        <w:t xml:space="preserve"> Etwas Kabinentypisches: Handtuch schnippen, Schattenboxen, Spiegel-Selfie mit (nicht vorhandenen) Muckis. Alles, außer sexistische Witze. Wobei.</w:t>
+        <w:t xml:space="preserve">Der Spind der Vorgängerin (ca. 3 Min.):</w:t>
+      </w:r>
+      <w:r>
+        <w:t xml:space="preserve"> Die Gästin reagiert auf den Gegenstand, den ihre Vorgängerin im Spind hinterlassen hat, und bestückt den Spind für die nächste Folge.</w:t>
       </w:r>
     </w:p>
     <w:p>
@@ -717,29 +717,18 @@
           <w:b/>
           <w:bCs/>
         </w:rPr>
-        <w:t xml:space="preserve">Motivationssprüche-Gericht (ca. 4 Min.):</w:t>
-      </w:r>
-      <w:r>
-        <w:t xml:space="preserve"> Drei pro Gästin werden bewertet („Du kannst alles schaffen, wenn du nur willst“, „Erfolg hat drei Buchstaben: Tun“, …). Urteil: Wahrheit oder Kalenderspruch.</w:t>
-      </w:r>
-    </w:p>
-    <w:p>
-      <w:pPr>
-        <w:numPr>
-          <w:ilvl w:val="0"/>
-          <w:numId w:val="10"/>
-        </w:numPr>
-        <w:spacing w:after="100"/>
-      </w:pPr>
-      <w:r>
-        <w:rPr>
-          <w:b/>
-          <w:bCs/>
-        </w:rPr>
-        <w:t xml:space="preserve">Der Spind der Vorgängerin (ca. 3 Min.):</w:t>
-      </w:r>
-      <w:r>
-        <w:t xml:space="preserve"> Jede Gästin hinterlässt im Spind einen Gegenstand, auf den die nächste reagieren muss. Zum Schluss wird der Spind für die nächste Folge bestückt.</w:t>
+        <w:t xml:space="preserve">Schlussbild: Spiegel-Selfie (ca. 1 Min.):</w:t>
+      </w:r>
+      <w:r>
+        <w:t xml:space="preserve"> Posen mit (nicht vorhandenen) Muckis. Das Foto ist zugleich das Cover der Folge.</w:t>
+      </w:r>
+    </w:p>
+    <w:p>
+      <w:pPr>
+        <w:spacing w:after="100"/>
+      </w:pPr>
+      <w:r>
+        <w:t xml:space="preserve">Immer mit auf der Bank: der Proteinshake mit einem zur Agenda der Gästin passenden Namen („Der Umverteiler“, „Die Quote“ usw.). Er wird nebenbei getrunken und kommentiert, als Running Gag und nicht als eigener Programmpunkt.</w:t>
       </w:r>
     </w:p>
     <w:p>

</xml_diff>

<commit_message>
Keep the whole episode inside the locker room: no separate training area
Co-Authored-By: Claude Opus 5.5 <noreply@anthropic.com>
Claude-Session: https://claude.ai/code/session_0137k8WBPQi7xN5FQteosu59
</commit_message>
<xml_diff>
--- a/pitches/LOCKER_ROOM_TALK_TV.docx
+++ b/pitches/LOCKER_ROOM_TALK_TV.docx
@@ -414,7 +414,7 @@
         <w:spacing w:after="100"/>
       </w:pPr>
       <w:r>
-        <w:t xml:space="preserve">Eine Umkleidekabine, wie man sie kennt: Neonlicht, Spinde, Holzbank, ein Fön, der nicht funktioniert, ein paar Hanteln, gleich nebenan der Trainingsbereich. Katja in Sporthose, Gästin im Trainingsoutfit. Alles ein bisschen drüber. Ein Set, ein Host, eine Gästin: Im Blockdreh entstehen drei bis vier Folgen an einem Tag.</w:t>
+        <w:t xml:space="preserve">Eine Umkleidekabine, wie man sie kennt: Neonlicht, Spinde, Holzbank, ein Fön, der nicht funktioniert, eine Klimmzugstange im Türrahmen, Kurzhanteln unter der Bank. Gespielt wird ausschließlich in der Kabine, ohne Ortswechsel. Katja in Sporthose, Gästin im Trainingsoutfit. Alles ein bisschen drüber. Ein Set, ein Host, eine Gästin: Im Blockdreh entstehen drei bis vier Folgen an einem Tag.</w:t>
       </w:r>
     </w:p>
     <w:p>
@@ -644,7 +644,7 @@
         <w:t xml:space="preserve">Aufwärmen (ca. 6 Min.):</w:t>
       </w:r>
       <w:r>
-        <w:t xml:space="preserve"> Laufband, Schattenboxen, Handtuch schnippen. Dabei geht es ums Persönliche: Herkunft, Werdegang, Turning Points. Wer außer Atem ist, redet ehrlicher.</w:t>
+        <w:t xml:space="preserve"> Seilspringen, Schattenboxen, Handtuch schnippen, mitten in der Kabine. Dabei geht es ums Persönliche: Herkunft, Werdegang, Turning Points. Wer außer Atem ist, redet ehrlicher.</w:t>
       </w:r>
     </w:p>
     <w:p>
@@ -682,7 +682,7 @@
         <w:t xml:space="preserve">Hantel-Runde (ca. 7 Min.):</w:t>
       </w:r>
       <w:r>
-        <w:t xml:space="preserve"> Der Höhepunkt: Jetzt kommen die steilsten Thesen der Gästin auf den Tisch. Je steiler die These, desto schwerer die Hantel.</w:t>
+        <w:t xml:space="preserve"> Der Höhepunkt, direkt auf der Bank: Die Kurzhanteln kommen unter der Bank hervor, und mit ihnen die steilsten Thesen der Gästin. Je steiler die These, desto schwerer die Hantel.</w:t>
       </w:r>
     </w:p>
     <w:p>

</xml_diff>

<commit_message>
Adopt edited video podcast pitch and derive matching TV version
Co-Authored-By: Claude Opus 5.5 <noreply@anthropic.com>
Claude-Session: https://claude.ai/code/session_0137k8WBPQi7xN5FQteosu59
</commit_message>
<xml_diff>
--- a/pitches/LOCKER_ROOM_TALK_TV.docx
+++ b/pitches/LOCKER_ROOM_TALK_TV.docx
@@ -14,7 +14,7 @@
           <w:sz w:val="40"/>
           <w:szCs w:val="40"/>
         </w:rPr>
-        <w:t xml:space="preserve">LOCKER ROOM TALK</w:t>
+        <w:t>LOCKER ROOM TALK</w:t>
       </w:r>
     </w:p>
     <w:p>
@@ -27,7 +27,7 @@
           <w:i/>
           <w:iCs/>
         </w:rPr>
-        <w:t xml:space="preserve">mit Katja Lewina</w:t>
+        <w:t>mit Katja Lewina</w:t>
       </w:r>
     </w:p>
     <w:p>
@@ -40,7 +40,7 @@
           <w:i/>
           <w:iCs/>
         </w:rPr>
-        <w:t xml:space="preserve">Gesprächsshow · Mediathek &amp; Late Night · 10 × 30 Min.</w:t>
+        <w:t>Gesprächsshow · Mediathek &amp; Late Night · 10 × 30 Min.</w:t>
       </w:r>
     </w:p>
     <w:p>
@@ -66,67 +66,7 @@
           <w:sz w:val="20"/>
           <w:szCs w:val="20"/>
         </w:rPr>
-        <w:t>Locker Room Talk, [ˈ</w:t>
-      </w:r>
-      <w:proofErr w:type="spellStart"/>
-      <w:r>
-        <w:rPr>
-          <w:b/>
-          <w:bCs/>
-          <w:sz w:val="20"/>
-          <w:szCs w:val="20"/>
-        </w:rPr>
-        <w:t>lɔkɐ</w:t>
-      </w:r>
-      <w:proofErr w:type="spellEnd"/>
-      <w:r>
-        <w:rPr>
-          <w:b/>
-          <w:bCs/>
-          <w:sz w:val="20"/>
-          <w:szCs w:val="20"/>
-        </w:rPr>
-        <w:t xml:space="preserve"> </w:t>
-      </w:r>
-      <w:proofErr w:type="spellStart"/>
-      <w:r>
-        <w:rPr>
-          <w:b/>
-          <w:bCs/>
-          <w:sz w:val="20"/>
-          <w:szCs w:val="20"/>
-        </w:rPr>
-        <w:t>ruːm</w:t>
-      </w:r>
-      <w:proofErr w:type="spellEnd"/>
-      <w:r>
-        <w:rPr>
-          <w:b/>
-          <w:bCs/>
-          <w:sz w:val="20"/>
-          <w:szCs w:val="20"/>
-        </w:rPr>
-        <w:t xml:space="preserve"> </w:t>
-      </w:r>
-      <w:proofErr w:type="spellStart"/>
-      <w:r>
-        <w:rPr>
-          <w:b/>
-          <w:bCs/>
-          <w:sz w:val="20"/>
-          <w:szCs w:val="20"/>
-        </w:rPr>
-        <w:t>tɔːk</w:t>
-      </w:r>
-      <w:proofErr w:type="spellEnd"/>
-      <w:r>
-        <w:rPr>
-          <w:b/>
-          <w:bCs/>
-          <w:sz w:val="20"/>
-          <w:szCs w:val="20"/>
-        </w:rPr>
-        <w:t>]</w:t>
+        <w:t xml:space="preserve">Locker Room Talk, [ˈlɔkɐ ruːm tɔːk]</w:t>
       </w:r>
       <w:r>
         <w:rPr>
@@ -135,7 +75,6 @@
         </w:rPr>
         <w:t> </w:t>
       </w:r>
-      <w:proofErr w:type="spellStart"/>
       <w:r>
         <w:rPr>
           <w:i/>
@@ -143,19 +82,24 @@
           <w:sz w:val="20"/>
           <w:szCs w:val="20"/>
         </w:rPr>
-        <w:t>Subst</w:t>
-      </w:r>
-      <w:proofErr w:type="spellEnd"/>
-      <w:r>
+        <w:t xml:space="preserve">Subst. m.; -s, kein Plur.; aus dem Englischen; </w:t>
+      </w:r>
+    </w:p>
+    <w:p>
+      <w:pPr>
+        <w:pStyle w:val="Listenabsatz"/>
+        <w:numPr>
+          <w:ilvl w:val="0"/>
+          <w:numId w:val="8"/>
+        </w:numPr>
+        <w:spacing w:after="100"/>
         <w:rPr>
           <w:i/>
           <w:iCs/>
           <w:sz w:val="20"/>
           <w:szCs w:val="20"/>
         </w:rPr>
-        <w:t xml:space="preserve">. m.; -s, kein </w:t>
-      </w:r>
-      <w:proofErr w:type="spellStart"/>
+      </w:pPr>
       <w:r>
         <w:rPr>
           <w:i/>
@@ -163,69 +107,7 @@
           <w:sz w:val="20"/>
           <w:szCs w:val="20"/>
         </w:rPr>
-        <w:t>Plur</w:t>
-      </w:r>
-      <w:proofErr w:type="spellEnd"/>
-      <w:r>
-        <w:rPr>
-          <w:i/>
-          <w:iCs/>
-          <w:sz w:val="20"/>
-          <w:szCs w:val="20"/>
-        </w:rPr>
-        <w:t>.; aus dem</w:t>
-      </w:r>
-      <w:r>
-        <w:rPr>
-          <w:i/>
-          <w:iCs/>
-          <w:sz w:val="20"/>
-          <w:szCs w:val="20"/>
-        </w:rPr>
-        <w:t xml:space="preserve"> </w:t>
-      </w:r>
-      <w:r>
-        <w:rPr>
-          <w:i/>
-          <w:iCs/>
-          <w:sz w:val="20"/>
-          <w:szCs w:val="20"/>
-        </w:rPr>
-        <w:t xml:space="preserve">Englischen; </w:t>
-      </w:r>
-    </w:p>
-    <w:p>
-      <w:pPr>
-        <w:pStyle w:val="Listenabsatz"/>
-        <w:numPr>
-          <w:ilvl w:val="0"/>
-          <w:numId w:val="8"/>
-        </w:numPr>
-        <w:spacing w:after="100"/>
-        <w:rPr>
-          <w:i/>
-          <w:iCs/>
-          <w:sz w:val="20"/>
-          <w:szCs w:val="20"/>
-        </w:rPr>
-      </w:pPr>
-      <w:r>
-        <w:rPr>
-          <w:i/>
-          <w:iCs/>
-          <w:sz w:val="20"/>
-          <w:szCs w:val="20"/>
-        </w:rPr>
-        <w:t xml:space="preserve">(alt) </w:t>
-      </w:r>
-      <w:r>
-        <w:rPr>
-          <w:i/>
-          <w:iCs/>
-          <w:sz w:val="20"/>
-          <w:szCs w:val="20"/>
-        </w:rPr>
-        <w:t xml:space="preserve">abwertend für: derbe, oft sexistische Rede unter Männern in gefliesten, nach Käsefuß riechenden Räumen. </w:t>
+        <w:t xml:space="preserve">(alt) abwertend für: derbe, oft sexistische Rede unter Männern in gefliesten, nach Käsefuß riechenden Räumen. </w:t>
       </w:r>
     </w:p>
     <w:p>
@@ -284,7 +166,7 @@
         <w:spacing w:after="100"/>
       </w:pPr>
       <w:r>
-        <w:t xml:space="preserve">Katja Lewina schnappt sich eine Frau mit großer Vision, steckt sie in die Umkleidekabine einer Muckibude und macht aus einem schändlichen Ausrutscher der Politikgeschichte eine Machtzentrale für die Weltrevolution. Handtuch-Schnippen inklusive.</w:t>
+        <w:t>Katja Lewina schnappt sich eine Frau mit großer Vision, steckt sie in die Umkleidekabine einer Muckibude und macht aus dem schändlichsten Ausrutscher der Politikgeschichte eine Machtzentrale für die Weltrevolution. Handtuch-Schnippen inklusive.</w:t>
       </w:r>
     </w:p>
     <w:p>
@@ -302,23 +184,23 @@
           <w:b/>
           <w:bCs/>
         </w:rPr>
-        <w:t xml:space="preserve">Die Idee</w:t>
-      </w:r>
-    </w:p>
-    <w:p>
-      <w:pPr>
-        <w:spacing w:after="100"/>
-      </w:pPr>
-      <w:r>
-        <w:t xml:space="preserve">Wir übernehmen den Laden. Der Spind gehört jetzt uns, die Bank auch, und das Gespräch erst recht. In „Locker Room Talk“ reden Frauen über Macht, Utopien und die Frage, wie man die Weltlage zum Besseren verändert, während die Männer draußen warten dürfen. Genau: Männer kommen hier nicht rein, nicht als Gäste und nicht auf die Bank. Über sie reden wir nur, wenn wir Lust dazu haben. Wir haben Wichtigeres zu tun, zum Beispiel das Patriarchat zu stemmen. Und dabei natürlich ein paar Sprüche zu reißen.</w:t>
-      </w:r>
-    </w:p>
-    <w:p>
-      <w:pPr>
-        <w:spacing w:after="100"/>
-      </w:pPr>
-      <w:r>
-        <w:t xml:space="preserve">Jede Folge geht vom Persönlichen ins große Ganze: Wir starten beim Kleinklein (Herkunft, Werdegang, Turning Points) und landen bei der Frage, wie wir Zukunft gestalten können, als Gesellschaft, aber auch als Einzelpersonen.</w:t>
+        <w:t>Die Idee</w:t>
+      </w:r>
+    </w:p>
+    <w:p>
+      <w:pPr>
+        <w:spacing w:after="100"/>
+      </w:pPr>
+      <w:r>
+        <w:t>Wir übernehmen den Laden. Der Spind gehört jetzt uns, die Bank auch, und das Gespräch erst recht. In „Locker Room Talk“ reden Frauen über Macht, Utopien und die Frage, wie man die Weltlage zum Besseren verändert, während die Männer draußen warten dürfen. Genau: Männer kommen hier nicht rein, nicht als Gäste und nicht auf die Bank. Über sie reden wir nur, wenn wir Lust dazu haben. Wir haben Wichtigeres zu tun, zum Beispiel das Patriarchat zu stemmen. Und dabei natürlich ein paar Sprüche zu reißen.</w:t>
+      </w:r>
+    </w:p>
+    <w:p>
+      <w:pPr>
+        <w:spacing w:after="100"/>
+      </w:pPr>
+      <w:r>
+        <w:t>Jede Folge geht vom Persönlichen ins große Ganze: Wir starten beim Kleinklein (Herkunft, Werdegang, Turning Points) und landen bei der Frage, wie wir Zukunft gestalten können, als Gesellschaft, aber auch als Einzelpersonen.</w:t>
       </w:r>
     </w:p>
     <w:p>
@@ -336,7 +218,7 @@
           <w:b/>
           <w:bCs/>
         </w:rPr>
-        <w:t xml:space="preserve">Das Format auf einen Blick</w:t>
+        <w:t>Das Format auf einen Blick</w:t>
       </w:r>
     </w:p>
     <w:p>
@@ -362,7 +244,7 @@
         <w:spacing w:after="100"/>
       </w:pPr>
       <w:r>
-        <w:t xml:space="preserve">Mediathek-first, dazu ein lineares Late-Night-Fenster; ideal für ein junges, erwachsenes Publikum</w:t>
+        <w:t>Mediathek-first, dazu ein lineares Late-Night-Fenster; ausgespielt zweiwöchentlich oder als Staffel am Stück</w:t>
       </w:r>
     </w:p>
     <w:p>
@@ -375,7 +257,7 @@
         <w:spacing w:after="100"/>
       </w:pPr>
       <w:r>
-        <w:t xml:space="preserve">Ausspielung zweiwöchentlich oder als Staffel am Stück</w:t>
+        <w:t>Staffel 1: 10 Folgen, Start rund um Februar 2027</w:t>
       </w:r>
     </w:p>
     <w:p>
@@ -388,7 +270,7 @@
         <w:spacing w:after="100"/>
       </w:pPr>
       <w:r>
-        <w:t xml:space="preserve">Pro Folge Hochkant-Clips für Social Media und auf Wunsch eine Podcast-Fassung</w:t>
+        <w:t>Pro Folge 3 bis 5 Hochkant-Clips für Instagram, TikTok und YouTube Shorts, auf Wunsch zusätzlich eine Podcast-Fassung</w:t>
       </w:r>
     </w:p>
     <w:p>
@@ -406,15 +288,15 @@
           <w:b/>
           <w:bCs/>
         </w:rPr>
-        <w:t xml:space="preserve">Setting &amp; Look</w:t>
-      </w:r>
-    </w:p>
-    <w:p>
-      <w:pPr>
-        <w:spacing w:after="100"/>
-      </w:pPr>
-      <w:r>
-        <w:t xml:space="preserve">Eine Umkleidekabine, wie man sie kennt: Neonlicht, Spinde, Holzbank, ein Fön, der nicht funktioniert, eine Klimmzugstange im Türrahmen, Kurzhanteln unter der Bank. Gespielt wird ausschließlich in der Kabine, ohne Ortswechsel. Katja in Sporthose, Gästin im Trainingsoutfit. Alles ein bisschen drüber. Ein Set, ein Host, eine Gästin: Im Blockdreh entstehen drei bis vier Folgen an einem Tag.</w:t>
+        <w:t>Setting &amp; Look</w:t>
+      </w:r>
+    </w:p>
+    <w:p>
+      <w:pPr>
+        <w:spacing w:after="100"/>
+      </w:pPr>
+      <w:r>
+        <w:t xml:space="preserve">Eine Umkleidekabine in einem echten Fitnessstudio: Neonlicht, Spinde, Holzbank, ein Fön, der nicht funktioniert, eine Klimmzugstange im Türrahmen, Kurzhanteln unter der Bank. Gespielt wird ausschließlich in der Kabine. Katja in Sporthose, Gästin im Trainingsoutfit. Alles ein bisschen drüber. </w:t>
       </w:r>
     </w:p>
     <w:p>
@@ -432,23 +314,24 @@
           <w:b/>
           <w:bCs/>
         </w:rPr>
-        <w:t xml:space="preserve">Gästinnen</w:t>
-      </w:r>
-    </w:p>
-    <w:p>
-      <w:pPr>
-        <w:spacing w:after="100"/>
-      </w:pPr>
-      <w:r>
-        <w:t xml:space="preserve">Eine pro Folge. Frauen, die die Welt umkrempeln wollen: Politikerinnen, Sachbuch-Autorinnen mit streitbaren Thesen, Künstlerinnen, Musikerinnen, Aktivistinnen. Intellektuell und populär bunt gemischt, Kontroversität und inhaltliche Reibung explizit erwünscht. Einzige Bedingung: Sie müssen über sich selbst lachen können, sonst ist das alles nix.</w:t>
-      </w:r>
-    </w:p>
-    <w:p>
-      <w:pPr>
-        <w:spacing w:after="100"/>
-      </w:pPr>
-      <w:r>
-        <w:t xml:space="preserve">Wunschliste (erster, schneller Aufschlag):</w:t>
+        <w:lastRenderedPageBreak/>
+        <w:t>Gästinnen</w:t>
+      </w:r>
+    </w:p>
+    <w:p>
+      <w:pPr>
+        <w:spacing w:after="100"/>
+      </w:pPr>
+      <w:r>
+        <w:t>Eine pro Folge. Frauen, die die Welt umkrempeln wollen: Politikerinnen, Sachbuch-Autorinnen mit streitbaren Thesen, Künstlerinnen, Musikerinnen, Aktivistinnen. Intellektuell und populär bunt gemischt, Kontroversität und inhaltliche Reibung explizit erwünscht. Einzige Bedingung: Sie müssen über sich selbst lachen können, sonst ist das alles nix.</w:t>
+      </w:r>
+    </w:p>
+    <w:p>
+      <w:pPr>
+        <w:spacing w:after="100"/>
+      </w:pPr>
+      <w:r>
+        <w:t>Wunschliste (erster, schneller Aufschlag):</w:t>
       </w:r>
     </w:p>
     <w:p>
@@ -461,7 +344,7 @@
         <w:spacing w:after="100"/>
       </w:pPr>
       <w:r>
-        <w:t xml:space="preserve">Ikkimel (Rapperin)</w:t>
+        <w:t>Ikkimel (Rapperin)</w:t>
       </w:r>
     </w:p>
     <w:p>
@@ -474,7 +357,7 @@
         <w:spacing w:after="100"/>
       </w:pPr>
       <w:r>
-        <w:t xml:space="preserve">Heidi Reichinnek (Politikerin)</w:t>
+        <w:t>Heidi Reichinnek (Politikerin)</w:t>
       </w:r>
     </w:p>
     <w:p>
@@ -487,7 +370,7 @@
         <w:spacing w:after="100"/>
       </w:pPr>
       <w:r>
-        <w:t xml:space="preserve">Agnes Strack-Zimmermann (Politikerin)</w:t>
+        <w:t>Agnes Strack-Zimmermann (Politikerin)</w:t>
       </w:r>
     </w:p>
     <w:p>
@@ -500,7 +383,7 @@
         <w:spacing w:after="100"/>
       </w:pPr>
       <w:r>
-        <w:t xml:space="preserve">Sally Lisa Starken (Aktivistin)</w:t>
+        <w:t>Sally Lisa Starken (Aktivistin)</w:t>
       </w:r>
     </w:p>
     <w:p>
@@ -513,7 +396,7 @@
         <w:spacing w:after="100"/>
       </w:pPr>
       <w:r>
-        <w:t xml:space="preserve">Alice Schwarzer (Publizistin)</w:t>
+        <w:t>Alice Schwarzer (Publizistin)</w:t>
       </w:r>
     </w:p>
     <w:p>
@@ -526,7 +409,7 @@
         <w:spacing w:after="100"/>
       </w:pPr>
       <w:r>
-        <w:t xml:space="preserve">Melanie Amann (Journalistin)</w:t>
+        <w:t>Melanie Amann (Journalistin)</w:t>
       </w:r>
     </w:p>
     <w:p>
@@ -539,7 +422,7 @@
         <w:spacing w:after="100"/>
       </w:pPr>
       <w:r>
-        <w:t xml:space="preserve">Franca Lehfeldt (Journalistin und Buchautorin: „Gute Mütter, schlechte Mütter“)</w:t>
+        <w:t>Franca Lehfeldt (Journalistin und Buchautorin: „Gute Mütter, schlechte Mütter“)</w:t>
       </w:r>
     </w:p>
     <w:p>
@@ -552,7 +435,7 @@
         <w:spacing w:after="100"/>
       </w:pPr>
       <w:r>
-        <w:t xml:space="preserve">Isabella M. Weber (Ökonomin und Buchautorin: „Antifaschistische Wirtschaftspolitik“)</w:t>
+        <w:t>Isabella M. Weber (Ökonomin und Buchautorin: „Antifaschistische Wirtschaftspolitik“)</w:t>
       </w:r>
     </w:p>
     <w:p>
@@ -565,7 +448,7 @@
         <w:spacing w:after="100"/>
       </w:pPr>
       <w:r>
-        <w:t xml:space="preserve">Cindy Adriana Speich (Content-Creatorin: @haus_plan_b)</w:t>
+        <w:t>Cindy Adriana Speich (Content-Creatorin: @haus_plan_b)</w:t>
       </w:r>
     </w:p>
     <w:p>
@@ -577,10 +460,10 @@
           <w:b/>
           <w:bCs/>
         </w:rPr>
-        <w:t xml:space="preserve">Kabinenregel:</w:t>
-      </w:r>
-      <w:r>
-        <w:t xml:space="preserve"> Hier wird niemand vorgeführt. Gestritten wird hart, aber fair, und wer eine These aufstellt, muss sie auch halten. So trauen sich auch Gästinnen auf die Bank, die mit Katja (und mit „Bye Bye Boys“) überhaupt nicht einverstanden sind.</w:t>
+        <w:t>Kabinenregel:</w:t>
+      </w:r>
+      <w:r>
+        <w:t xml:space="preserve"> Hier wird niemand vorgeführt. So trauen sich auch Gästinnen auf die Bank, die mit Katja überhaupt nicht einverstanden sind.</w:t>
       </w:r>
     </w:p>
     <w:p>
@@ -598,15 +481,24 @@
           <w:b/>
           <w:bCs/>
         </w:rPr>
-        <w:t xml:space="preserve">Was in einer Folge passiert (30 Min.)</w:t>
-      </w:r>
-    </w:p>
-    <w:p>
-      <w:pPr>
-        <w:spacing w:after="100"/>
-      </w:pPr>
-      <w:r>
-        <w:t xml:space="preserve">Es ist und bleibt ein Gesprächsformat: Die Gästinnen setzen die Themen mit ihren Inhalten, aber auch mit ihrer Geschichte. Jede Folge folgt derselben Kurve: erst warm werden, dann tief reden, dann knallt es. Drei Programmpunkte, zwei kurze Rituale:</w:t>
+        <w:t>Was in einer Folge passiert (30 Min.)</w:t>
+      </w:r>
+    </w:p>
+    <w:p>
+      <w:pPr>
+        <w:spacing w:after="100"/>
+        <w:rPr>
+          <w:rFonts w:cstheme="minorHAnsi"/>
+        </w:rPr>
+      </w:pPr>
+      <w:r>
+        <w:t xml:space="preserve">Es ist und bleibt ein Gesprächsformat: Die Gästinnen setzen die Themen mit ihren Inhalten, </w:t>
+      </w:r>
+      <w:r>
+        <w:rPr>
+          <w:rFonts w:cstheme="minorHAnsi"/>
+        </w:rPr>
+        <w:t xml:space="preserve">aber auch mit ihrer Geschichte. Jede Folge folgt derselben Kurve: erst warm werden, dann tief reden, dann knallt es.</w:t>
       </w:r>
     </w:p>
     <w:p>
@@ -619,13 +511,26 @@
       </w:pPr>
       <w:r>
         <w:rPr>
+          <w:rFonts w:cstheme="minorHAnsi"/>
           <w:b/>
           <w:bCs/>
         </w:rPr>
-        <w:t xml:space="preserve">Kaltstart: Mitgliedsantrag (ca. 1 Min.):</w:t>
-      </w:r>
-      <w:r>
-        <w:t xml:space="preserve"> Die Gästin kommt in Straßenkleidung und zieht sich um. Währenddessen liest Katja ihren Mitgliedsantrag für die Muckibude vor: Trainingsziel („Patriarchat stemmen“), bisherige Verletzungen („Shitstorm 2023“), Maximalgewicht („eine Koalition“). Die Gästin korrigiert und kommentiert live.</w:t>
+        <w:t>Mitgliedsantrag (ca. 1 Min.):</w:t>
+      </w:r>
+      <w:r>
+        <w:rPr>
+          <w:rFonts w:cstheme="minorHAnsi"/>
+        </w:rPr>
+        <w:t xml:space="preserve"> Die Gästin legt sich ein Handtuch um, bekommt einen Proteinshake. Währenddessen liest Katja ihren Mitgliedsantrag für die Muckibude vor: Trainingsziel (bei Heidi Reichinnek z. B. </w:t>
+      </w:r>
+      <w:r>
+        <w:rPr>
+          <w:rFonts w:cstheme="minorHAnsi"/>
+        </w:rPr>
+        <w:t xml:space="preserve">„Kapitalismus abschaffen“), bisherige Verletzungen („Stimmbänder überdehnt bei der ‚Auf die Barrikaden‘-Rede 2025, </w:t>
+      </w:r>
+      <w:r>
+        <w:t xml:space="preserve">chronische Reizung durch den Vorwurf ‚zu wütend‘“), besondere Körpermerkmale (Tattoos ansprechen), Maximalgewicht („Eine ganze Bundestagsfraktion. Eine Koalition wurde noch nie gestemmt.“). Die Gästin korrigiert und kommentiert live.</w:t>
       </w:r>
     </w:p>
     <w:p>
@@ -641,10 +546,10 @@
           <w:b/>
           <w:bCs/>
         </w:rPr>
-        <w:t xml:space="preserve">Aufwärmen (ca. 6 Min.):</w:t>
-      </w:r>
-      <w:r>
-        <w:t xml:space="preserve"> Seilspringen, Schattenboxen, Handtuch schnippen, mitten in der Kabine. Dabei geht es ums Persönliche: Herkunft, Werdegang, Turning Points. Wer außer Atem ist, redet ehrlicher.</w:t>
+        <w:t>Aufwärmen (ca. 5 Min.):</w:t>
+      </w:r>
+      <w:r>
+        <w:t xml:space="preserve"> Seilspringen, Schattenboxen, Handtuch schnippen, mitten in der Kabine. Dabei geht es ums Persönliche: Herkunft, Werdegang, Turning Points. </w:t>
       </w:r>
     </w:p>
     <w:p>
@@ -660,10 +565,10 @@
           <w:b/>
           <w:bCs/>
         </w:rPr>
-        <w:t xml:space="preserve">Auf der Bank (ca. 12 Min.):</w:t>
-      </w:r>
-      <w:r>
-        <w:t xml:space="preserve"> Das Herzstück: vom eigenen Weg zur großen Frage, wie die Gästin die Welt umbauen würde. Und was sie von „Bye Bye Boys“ hält.</w:t>
+        <w:t>Hantel-Runde (ca. 6 Min.):</w:t>
+      </w:r>
+      <w:r>
+        <w:t xml:space="preserve"> Die Kurzhanteln kommen unter der Bank hervor, und mit ihnen die steilsten Thesen der Gästin. Je steiler die These, desto schwerer die Hantel. Katja sagt an, was gestemmt wird, Ächzen ist erwünscht.</w:t>
       </w:r>
     </w:p>
     <w:p>
@@ -679,10 +584,10 @@
           <w:b/>
           <w:bCs/>
         </w:rPr>
-        <w:t xml:space="preserve">Hantel-Runde (ca. 7 Min.):</w:t>
-      </w:r>
-      <w:r>
-        <w:t xml:space="preserve"> Der Höhepunkt, direkt auf der Bank: Die Kurzhanteln kommen unter der Bank hervor, und mit ihnen die steilsten Thesen der Gästin. Je steiler die These, desto schwerer die Hantel.</w:t>
+        <w:t>Auf der Bank (ca. 11 Min.):</w:t>
+      </w:r>
+      <w:r>
+        <w:t xml:space="preserve"> Das Herzstück und der längste Teil der Folge: die große Frage, wie die Gästin die Welt umbauen würde. </w:t>
       </w:r>
     </w:p>
     <w:p>
@@ -698,10 +603,10 @@
           <w:b/>
           <w:bCs/>
         </w:rPr>
-        <w:t xml:space="preserve">Der Spind der Vorgängerin (ca. 3 Min.):</w:t>
-      </w:r>
-      <w:r>
-        <w:t xml:space="preserve"> Die Gästin reagiert auf den Gegenstand, den ihre Vorgängerin im Spind hinterlassen hat, und bestückt den Spind für die nächste Folge.</w:t>
+        <w:t>Kabinen-Blitzrunde (ca. 3 Min.):</w:t>
+      </w:r>
+      <w:r>
+        <w:t xml:space="preserve"> Zehn Streitfragen, keine Erklärungen, nur Ja oder Nein. Sexarbeit verbieten? Wehrpflicht für Frauen? Brauchen wir die Männer noch?</w:t>
       </w:r>
     </w:p>
     <w:p>
@@ -717,28 +622,18 @@
           <w:b/>
           <w:bCs/>
         </w:rPr>
-        <w:t xml:space="preserve">Schlussbild: Spiegel-Selfie (ca. 1 Min.):</w:t>
-      </w:r>
-      <w:r>
-        <w:t xml:space="preserve"> Posen mit (nicht vorhandenen) Muckis. Das Foto ist zugleich das Cover der Folge.</w:t>
-      </w:r>
-    </w:p>
-    <w:p>
-      <w:pPr>
-        <w:spacing w:after="100"/>
-      </w:pPr>
-      <w:r>
-        <w:t xml:space="preserve">Immer mit auf der Bank: der Proteinshake mit einem zur Agenda der Gästin passenden Namen („Der Umverteiler“, „Die Quote“ usw.). Er wird nebenbei getrunken und kommentiert, als Running Gag und nicht als eigener Programmpunkt.</w:t>
-      </w:r>
-    </w:p>
-    <w:p>
-      <w:pPr>
-        <w:spacing w:after="100"/>
-      </w:pPr>
-    </w:p>
-    <w:p>
-      <w:pPr>
-        <w:keepNext/>
+        <w:t>Der Spind der Vorgängerin (ca. 3 Min.):</w:t>
+      </w:r>
+      <w:r>
+        <w:t xml:space="preserve"> Jede Gästin hinterlässt im Spind einen Gegenstand und eine These, auf die die nächste reagieren muss. So streiten die Gästinnen auch über die Folgen hinweg miteinander.</w:t>
+      </w:r>
+    </w:p>
+    <w:p>
+      <w:pPr>
+        <w:numPr>
+          <w:ilvl w:val="0"/>
+          <w:numId w:val="10"/>
+        </w:numPr>
         <w:spacing w:after="100"/>
       </w:pPr>
       <w:r>
@@ -746,47 +641,19 @@
           <w:b/>
           <w:bCs/>
         </w:rPr>
-        <w:t xml:space="preserve">Warum Katja Lewina, warum jetzt</w:t>
-      </w:r>
-    </w:p>
-    <w:p>
-      <w:pPr>
-        <w:spacing w:after="100"/>
-      </w:pPr>
-      <w:r>
-        <w:t xml:space="preserve">Weil sie seit Jahren genau das macht, was diese Show braucht: über Dinge reden, über die man angeblich nicht redet, und dabei lustig bleiben. Katja hat bei DuMont fünf Bücher in sechs Jahren veröffentlicht, drei davon waren SPIEGEL-Bestseller. Sie schreibt für SPIEGEL, Stern, DIE ZEIT uvm. Als Host hat sie bei Podimo den Podcast „Schlachtfeld Liebe“ moderiert.</w:t>
-      </w:r>
-    </w:p>
-    <w:p>
-      <w:pPr>
-        <w:spacing w:after="100"/>
-      </w:pPr>
-      <w:r>
-        <w:t xml:space="preserve">Sie kann Feminismus, Sex, Beziehungen und Tod, alles mit derselben Leichtigkeit. Genau diesen Weg vom Persönlichen ins große Ganze geht jede Folge.</w:t>
-      </w:r>
-    </w:p>
-    <w:p>
-      <w:pPr>
-        <w:spacing w:after="100"/>
-      </w:pPr>
-      <w:r>
-        <w:t xml:space="preserve">Am 9. Februar 2027 erscheint Katjas neues Buch „Bye Bye Boys“, in dem sie den gesellschaftlichen (und natürlich auch privaten) Abschied von den Männern einläutet. Die Show wird keine Verlängerung des Buchs, aber seine These sitzt mit in der Kabine: Jede Gästin muss sich dazu verhalten, ob sie Katja zustimmt oder sie auseinandernimmt.</w:t>
-      </w:r>
-    </w:p>
-    <w:p>
-      <w:pPr>
-        <w:spacing w:after="100"/>
-      </w:pPr>
-      <w:r>
-        <w:t xml:space="preserve">Der Buchstart am 9. Februar 2027 ist das natürliche Startfenster für Staffel 1: Presse, Lesungen und Show greifen ineinander.</w:t>
-      </w:r>
-    </w:p>
-    <w:p>
-      <w:pPr>
-        <w:spacing w:after="100"/>
-      </w:pPr>
-      <w:r>
-        <w:t xml:space="preserve">Dank der Recherche ist der Autorin klar geworden: Das wird so nix mehr. Da müssen jetzt Frauen ran.</w:t>
+        <w:t>Schlussbild: Spiegel-Selfie (ca. 1 Min.):</w:t>
+      </w:r>
+      <w:r>
+        <w:t xml:space="preserve"> Posen mit (nicht vorhandenen) Muckis. Das Foto ist zugleich das Cover der Folge.</w:t>
+      </w:r>
+    </w:p>
+    <w:p>
+      <w:pPr>
+        <w:spacing w:after="100"/>
+      </w:pPr>
+      <w:r>
+        <w:lastRenderedPageBreak/>
+        <w:t>Immer mit auf der Bank: der Proteinshake mit einem zur Agenda der Gästin passenden Namen („Der Umverteiler“, „Die Quote“ usw.). Er wird nebenbei getrunken und kommentiert, als Running Gag und nicht als eigener Programmpunkt.</w:t>
       </w:r>
     </w:p>
     <w:p>
@@ -804,16 +671,107 @@
           <w:b/>
           <w:bCs/>
         </w:rPr>
-        <w:t xml:space="preserve">Nächster Schritt</w:t>
-      </w:r>
-    </w:p>
-    <w:p>
-      <w:pPr>
-        <w:spacing w:after="100"/>
-      </w:pPr>
-      <w:r>
-        <w:t xml:space="preserve">Wir entwickeln das Format gern gemeinsam mit einer Produktionsfirma weiter und drehen einen Piloten.</w:t>
-      </w:r>
+        <w:t>Social &amp; Ausspielung</w:t>
+      </w:r>
+    </w:p>
+    <w:p>
+      <w:pPr>
+        <w:pStyle w:val="Listenabsatz"/>
+        <w:numPr>
+          <w:ilvl w:val="0"/>
+          <w:numId w:val="9"/>
+        </w:numPr>
+        <w:spacing w:after="100"/>
+      </w:pPr>
+      <w:r>
+        <w:t>Das Spiegel-Selfie aus dem Schlussbild ist zugleich Thumbnail und Social-Cover jeder Folge.</w:t>
+      </w:r>
+    </w:p>
+    <w:p>
+      <w:pPr>
+        <w:pStyle w:val="Listenabsatz"/>
+        <w:numPr>
+          <w:ilvl w:val="0"/>
+          <w:numId w:val="9"/>
+        </w:numPr>
+        <w:spacing w:after="100"/>
+      </w:pPr>
+      <w:r>
+        <w:t>Clips aus Hantel-Runde und Blitzrunde sind für Hochkant gemacht und tragen die Folgen in die Feeds.</w:t>
+      </w:r>
+    </w:p>
+    <w:p>
+      <w:pPr>
+        <w:pStyle w:val="Listenabsatz"/>
+        <w:numPr>
+          <w:ilvl w:val="0"/>
+          <w:numId w:val="9"/>
+        </w:numPr>
+        <w:spacing w:after="100"/>
+      </w:pPr>
+      <w:r>
+        <w:t xml:space="preserve">Bei privaten Sendern und Streamern: natürliche Partnerflächen für Proteinshake, Sportmarke und Fitnessstudio als Location-Partner.</w:t>
+      </w:r>
+    </w:p>
+    <w:p>
+      <w:pPr>
+        <w:spacing w:after="100"/>
+      </w:pPr>
+    </w:p>
+    <w:p>
+      <w:pPr>
+        <w:keepNext/>
+        <w:spacing w:after="100"/>
+      </w:pPr>
+      <w:r>
+        <w:rPr>
+          <w:b/>
+          <w:bCs/>
+        </w:rPr>
+        <w:t>Warum Katja Lewina, warum jetzt</w:t>
+      </w:r>
+    </w:p>
+    <w:p>
+      <w:pPr>
+        <w:spacing w:after="100"/>
+      </w:pPr>
+      <w:r>
+        <w:t xml:space="preserve">Weil sie seit Jahren genau das macht, was diese Show braucht: über Dinge reden, über die man angeblich nicht redet, und dabei lustig bleiben. Katja hat bei DuMont fünf Bücher in sechs Jahren veröffentlicht, drei davon waren SPIEGEL-Bestseller. Sie schreibt für SPIEGEL, Stern, ZEIT uvm. Als Host hat sie bei Podimo den Podcast „Schlachtfeld Liebe“ moderiert.</w:t>
+      </w:r>
+    </w:p>
+    <w:p>
+      <w:pPr>
+        <w:spacing w:after="100"/>
+      </w:pPr>
+      <w:r>
+        <w:t>Sie kann Feminismus, Sex, Beziehungen und Tod, alles mit derselben Leichtigkeit. Genau diesen Weg vom Persönlichen ins große Ganze geht jede Folge.</w:t>
+      </w:r>
+    </w:p>
+    <w:p>
+      <w:pPr>
+        <w:spacing w:after="100"/>
+      </w:pPr>
+      <w:r>
+        <w:t>Am 9. Februar 2027 erscheint Katjas neues Buch „Bye Bye Boys“, in dem sie den gesellschaftlichen (und natürlich auch privaten) Abschied von den Männern einläutet. Die Show wird keine Verlängerung des Buchs, aber seine These sitzt mit in der Kabine: Jede Gästin muss sich dazu verhalten, ob sie Katja zustimmt oder sie auseinandernimmt.</w:t>
+      </w:r>
+    </w:p>
+    <w:p>
+      <w:pPr>
+        <w:spacing w:after="100"/>
+      </w:pPr>
+      <w:r>
+        <w:t>Dank der Recherche ist der Autorin klar geworden: Das wird so nix mehr. Da müssen jetzt Frauen ran.</w:t>
+      </w:r>
+    </w:p>
+    <w:p>
+      <w:pPr>
+        <w:spacing w:after="100"/>
+      </w:pPr>
+    </w:p>
+    <w:p>
+      <w:pPr>
+        <w:spacing w:after="100"/>
+      </w:pPr>
     </w:p>
     <w:sectPr>
       <w:pgSz w:w="11906" w:h="16838"/>
@@ -1909,6 +1867,155 @@
     </w:lvl>
   </w:abstractNum>
   <w:abstractNum w:abstractNumId="9" w15:restartNumberingAfterBreak="0">
+    <w:nsid w:val="67ED2F41"/>
+    <w:multiLevelType w:val="multilevel"/>
+    <w:tmpl w:val="1AC8E32E"/>
+    <w:lvl w:ilvl="0">
+      <w:start w:val="1"/>
+      <w:numFmt w:val="bullet"/>
+      <w:lvlText w:val=""/>
+      <w:lvlJc w:val="left"/>
+      <w:pPr>
+        <w:tabs>
+          <w:tab w:val="num" w:pos="720"/>
+        </w:tabs>
+        <w:ind w:left="720" w:hanging="360"/>
+      </w:pPr>
+      <w:rPr>
+        <w:rFonts w:ascii="Symbol" w:hAnsi="Symbol" w:hint="default"/>
+        <w:sz w:val="20"/>
+      </w:rPr>
+    </w:lvl>
+    <w:lvl w:ilvl="1" w:tentative="1">
+      <w:start w:val="1"/>
+      <w:numFmt w:val="bullet"/>
+      <w:lvlText w:val="o"/>
+      <w:lvlJc w:val="left"/>
+      <w:pPr>
+        <w:tabs>
+          <w:tab w:val="num" w:pos="1440"/>
+        </w:tabs>
+        <w:ind w:left="1440" w:hanging="360"/>
+      </w:pPr>
+      <w:rPr>
+        <w:rFonts w:ascii="Courier New" w:hAnsi="Courier New" w:hint="default"/>
+        <w:sz w:val="20"/>
+      </w:rPr>
+    </w:lvl>
+    <w:lvl w:ilvl="2" w:tentative="1">
+      <w:start w:val="1"/>
+      <w:numFmt w:val="bullet"/>
+      <w:lvlText w:val=""/>
+      <w:lvlJc w:val="left"/>
+      <w:pPr>
+        <w:tabs>
+          <w:tab w:val="num" w:pos="2160"/>
+        </w:tabs>
+        <w:ind w:left="2160" w:hanging="360"/>
+      </w:pPr>
+      <w:rPr>
+        <w:rFonts w:ascii="Wingdings" w:hAnsi="Wingdings" w:hint="default"/>
+        <w:sz w:val="20"/>
+      </w:rPr>
+    </w:lvl>
+    <w:lvl w:ilvl="3" w:tentative="1">
+      <w:start w:val="1"/>
+      <w:numFmt w:val="bullet"/>
+      <w:lvlText w:val=""/>
+      <w:lvlJc w:val="left"/>
+      <w:pPr>
+        <w:tabs>
+          <w:tab w:val="num" w:pos="2880"/>
+        </w:tabs>
+        <w:ind w:left="2880" w:hanging="360"/>
+      </w:pPr>
+      <w:rPr>
+        <w:rFonts w:ascii="Wingdings" w:hAnsi="Wingdings" w:hint="default"/>
+        <w:sz w:val="20"/>
+      </w:rPr>
+    </w:lvl>
+    <w:lvl w:ilvl="4" w:tentative="1">
+      <w:start w:val="1"/>
+      <w:numFmt w:val="bullet"/>
+      <w:lvlText w:val=""/>
+      <w:lvlJc w:val="left"/>
+      <w:pPr>
+        <w:tabs>
+          <w:tab w:val="num" w:pos="3600"/>
+        </w:tabs>
+        <w:ind w:left="3600" w:hanging="360"/>
+      </w:pPr>
+      <w:rPr>
+        <w:rFonts w:ascii="Wingdings" w:hAnsi="Wingdings" w:hint="default"/>
+        <w:sz w:val="20"/>
+      </w:rPr>
+    </w:lvl>
+    <w:lvl w:ilvl="5" w:tentative="1">
+      <w:start w:val="1"/>
+      <w:numFmt w:val="bullet"/>
+      <w:lvlText w:val=""/>
+      <w:lvlJc w:val="left"/>
+      <w:pPr>
+        <w:tabs>
+          <w:tab w:val="num" w:pos="4320"/>
+        </w:tabs>
+        <w:ind w:left="4320" w:hanging="360"/>
+      </w:pPr>
+      <w:rPr>
+        <w:rFonts w:ascii="Wingdings" w:hAnsi="Wingdings" w:hint="default"/>
+        <w:sz w:val="20"/>
+      </w:rPr>
+    </w:lvl>
+    <w:lvl w:ilvl="6" w:tentative="1">
+      <w:start w:val="1"/>
+      <w:numFmt w:val="bullet"/>
+      <w:lvlText w:val=""/>
+      <w:lvlJc w:val="left"/>
+      <w:pPr>
+        <w:tabs>
+          <w:tab w:val="num" w:pos="5040"/>
+        </w:tabs>
+        <w:ind w:left="5040" w:hanging="360"/>
+      </w:pPr>
+      <w:rPr>
+        <w:rFonts w:ascii="Wingdings" w:hAnsi="Wingdings" w:hint="default"/>
+        <w:sz w:val="20"/>
+      </w:rPr>
+    </w:lvl>
+    <w:lvl w:ilvl="7" w:tentative="1">
+      <w:start w:val="1"/>
+      <w:numFmt w:val="bullet"/>
+      <w:lvlText w:val=""/>
+      <w:lvlJc w:val="left"/>
+      <w:pPr>
+        <w:tabs>
+          <w:tab w:val="num" w:pos="5760"/>
+        </w:tabs>
+        <w:ind w:left="5760" w:hanging="360"/>
+      </w:pPr>
+      <w:rPr>
+        <w:rFonts w:ascii="Wingdings" w:hAnsi="Wingdings" w:hint="default"/>
+        <w:sz w:val="20"/>
+      </w:rPr>
+    </w:lvl>
+    <w:lvl w:ilvl="8" w:tentative="1">
+      <w:start w:val="1"/>
+      <w:numFmt w:val="bullet"/>
+      <w:lvlText w:val=""/>
+      <w:lvlJc w:val="left"/>
+      <w:pPr>
+        <w:tabs>
+          <w:tab w:val="num" w:pos="6480"/>
+        </w:tabs>
+        <w:ind w:left="6480" w:hanging="360"/>
+      </w:pPr>
+      <w:rPr>
+        <w:rFonts w:ascii="Wingdings" w:hAnsi="Wingdings" w:hint="default"/>
+        <w:sz w:val="20"/>
+      </w:rPr>
+    </w:lvl>
+  </w:abstractNum>
+  <w:abstractNum w:abstractNumId="10" w15:restartNumberingAfterBreak="0">
     <w:nsid w:val="7C7743B7"/>
     <w:multiLevelType w:val="hybridMultilevel"/>
     <w:tmpl w:val="EE642350"/>
@@ -2037,7 +2144,7 @@
     <w:abstractNumId w:val="5"/>
   </w:num>
   <w:num w:numId="6" w16cid:durableId="386030534">
-    <w:abstractNumId w:val="9"/>
+    <w:abstractNumId w:val="10"/>
   </w:num>
   <w:num w:numId="7" w16cid:durableId="2091348504">
     <w:abstractNumId w:val="3"/>
@@ -2050,6 +2157,9 @@
   </w:num>
   <w:num w:numId="10" w16cid:durableId="1005746835">
     <w:abstractNumId w:val="6"/>
+  </w:num>
+  <w:num w:numId="11" w16cid:durableId="41056344">
+    <w:abstractNumId w:val="9"/>
   </w:num>
 </w:numbering>
 </file>
@@ -2965,6 +3075,17 @@
       <w:spacing w:val="5"/>
     </w:rPr>
   </w:style>
+  <w:style w:type="paragraph" w:styleId="StandardWeb">
+    <w:name w:val="Normal (Web)"/>
+    <w:basedOn w:val="Standard"/>
+    <w:uiPriority w:val="99"/>
+    <w:semiHidden/>
+    <w:unhideWhenUsed/>
+    <w:rsid w:val="000C7B32"/>
+    <w:rPr>
+      <w:rFonts w:ascii="Times New Roman" w:hAnsi="Times New Roman" w:cs="Times New Roman"/>
+    </w:rPr>
+  </w:style>
 </w:styles>
 </file>
 

</xml_diff>

<commit_message>
Fix episode arc wording, typo and missing quotes in both pitches
Co-Authored-By: Claude Opus 5.5 <noreply@anthropic.com>
Claude-Session: https://claude.ai/code/session_0137k8WBPQi7xN5FQteosu59
</commit_message>
<xml_diff>
--- a/pitches/LOCKER_ROOM_TALK_TV.docx
+++ b/pitches/LOCKER_ROOM_TALK_TV.docx
@@ -166,7 +166,7 @@
         <w:spacing w:after="100"/>
       </w:pPr>
       <w:r>
-        <w:t>Katja Lewina schnappt sich eine Frau mit großer Vision, steckt sie in die Umkleidekabine einer Muckibude und macht aus dem schändlichsten Ausrutscher der Politikgeschichte eine Machtzentrale für die Weltrevolution. Handtuch-Schnippen inklusive.</w:t>
+        <w:t>Katja Lewina schnappt sich eine Frau mit großer Vision, steckt sie in die Umkleidekabine einer Muckibude und macht aus einem der schändlichsten Ausrutscher der Politikgeschichte eine Machtzentrale für die Weltrevolution. Handtuch-Schnippen inklusive.</w:t>
       </w:r>
     </w:p>
     <w:p>
@@ -498,7 +498,7 @@
         <w:rPr>
           <w:rFonts w:cstheme="minorHAnsi"/>
         </w:rPr>
-        <w:t xml:space="preserve">aber auch mit ihrer Geschichte. Jede Folge folgt derselben Kurve: erst warm werden, dann tief reden, dann knallt es.</w:t>
+        <w:t xml:space="preserve">aber auch mit ihrer Geschichte. Jede Folge folgt derselben Kurve: erst warm werden, dann knallt es, dann wird es grundsätzlich.</w:t>
       </w:r>
     </w:p>
     <w:p>
@@ -521,13 +521,7 @@
         <w:rPr>
           <w:rFonts w:cstheme="minorHAnsi"/>
         </w:rPr>
-        <w:t xml:space="preserve"> Die Gästin legt sich ein Handtuch um, bekommt einen Proteinshake. Währenddessen liest Katja ihren Mitgliedsantrag für die Muckibude vor: Trainingsziel (bei Heidi Reichinnek z. B. </w:t>
-      </w:r>
-      <w:r>
-        <w:rPr>
-          <w:rFonts w:cstheme="minorHAnsi"/>
-        </w:rPr>
-        <w:t xml:space="preserve">„Kapitalismus abschaffen“), bisherige Verletzungen („Stimmbänder überdehnt bei der ‚Auf die Barrikaden‘-Rede 2025, </w:t>
+        <w:t xml:space="preserve"> Die Gästin legt sich ein Handtuch um, bekommt einen Proteinshake. Währenddessen liest Katja ihren Mitgliedsantrag für die Muckibude vor: Trainingsziel (bei Heidi Reichinnek z. B. „Kapitalismus abschaffen“), bisherige Verletzungen („Stimmbänder überdehnt bei der ‚Auf die Barrikaden‘-Rede 2025, </w:t>
       </w:r>
       <w:r>
         <w:t xml:space="preserve">chronische Reizung durch den Vorwurf ‚zu wütend‘“), besondere Körpermerkmale (Tattoos ansprechen), Maximalgewicht („Eine ganze Bundestagsfraktion. Eine Koalition wurde noch nie gestemmt.“). Die Gästin korrigiert und kommentiert live.</w:t>

</xml_diff>